<commit_message>
esta funcional, pero hay que corregir temas aún
</commit_message>
<xml_diff>
--- a/admin.docx
+++ b/admin.docx
@@ -29,10 +29,50 @@
       </w:r>
     </w:p>
     <w:p>
+      <w:proofErr w:type="spellStart"/>
       <w:r>
         <w:t>admin</w:t>
       </w:r>
-    </w:p>
+      <w:proofErr w:type="spellEnd"/>
+    </w:p>
+    <w:p/>
+    <w:p>
+      <w:pPr>
+        <w:rPr>
+          <w:rFonts w:ascii="Arial" w:eastAsia="Times New Roman" w:hAnsi="Arial" w:cs="Arial"/>
+          <w:color w:val="595959"/>
+          <w:kern w:val="0"/>
+          <w:sz w:val="27"/>
+          <w:szCs w:val="27"/>
+          <w:lang w:eastAsia="es-CO"/>
+          <w14:ligatures w14:val="none"/>
+        </w:rPr>
+      </w:pPr>
+      <w:r>
+        <w:rPr>
+          <w:rFonts w:ascii="Arial" w:eastAsia="Times New Roman" w:hAnsi="Arial" w:cs="Arial"/>
+          <w:color w:val="595959"/>
+          <w:kern w:val="0"/>
+          <w:sz w:val="27"/>
+          <w:szCs w:val="27"/>
+          <w:lang w:eastAsia="es-CO"/>
+          <w14:ligatures w14:val="none"/>
+        </w:rPr>
+        <w:br/>
+      </w:r>
+      <w:r>
+        <w:rPr>
+          <w:rStyle w:val="Hipervnculo"/>
+        </w:rPr>
+        <w:t>caja01@inverlex.com</w:t>
+      </w:r>
+    </w:p>
+    <w:p>
+      <w:r>
+        <w:t>caja123*</w:t>
+      </w:r>
+    </w:p>
+    <w:p/>
     <w:p>
       <w:r>
         <w:t xml:space="preserve">Si este usuario no funciona o no existe en </w:t>
@@ -524,6 +564,7 @@
         <w:rPr>
           <w:lang w:val="en-US"/>
         </w:rPr>
+        <w:lastRenderedPageBreak/>
         <w:t xml:space="preserve">  </w:t>
       </w:r>
       <w:proofErr w:type="spellStart"/>
@@ -588,7 +629,6 @@
           <w:i/>
           <w:iCs/>
         </w:rPr>
-        <w:lastRenderedPageBreak/>
         <w:t>-- Obtener el ID del usuario recién creado</w:t>
       </w:r>
     </w:p>
@@ -1515,6 +1555,7 @@
   <w:style w:type="character" w:default="1" w:styleId="Fuentedeprrafopredeter">
     <w:name w:val="Default Paragraph Font"/>
     <w:uiPriority w:val="1"/>
+    <w:semiHidden/>
     <w:unhideWhenUsed/>
   </w:style>
   <w:style w:type="table" w:default="1" w:styleId="Tablanormal">

</xml_diff>

<commit_message>
ya los datos del cierre cuadran en la dashboard
</commit_message>
<xml_diff>
--- a/admin.docx
+++ b/admin.docx
@@ -921,6 +921,11 @@
       </w:r>
     </w:p>
     <w:p>
+      <w:pPr>
+        <w:rPr>
+          <w:lang w:val="en-US"/>
+        </w:rPr>
+      </w:pPr>
       <w:r>
         <w:rPr>
           <w:lang w:val="en-US"/>
@@ -928,20 +933,58 @@
         <w:t xml:space="preserve">    </w:t>
       </w:r>
       <w:r>
+        <w:rPr>
+          <w:lang w:val="en-US"/>
+        </w:rPr>
         <w:t>true</w:t>
       </w:r>
     </w:p>
     <w:p>
-      <w:r>
+      <w:pPr>
+        <w:rPr>
+          <w:lang w:val="en-US"/>
+        </w:rPr>
+      </w:pPr>
+      <w:r>
+        <w:rPr>
+          <w:lang w:val="en-US"/>
+        </w:rPr>
         <w:t xml:space="preserve">  );</w:t>
       </w:r>
     </w:p>
     <w:p>
-      <w:r>
+      <w:pPr>
+        <w:rPr>
+          <w:lang w:val="en-US"/>
+        </w:rPr>
+      </w:pPr>
+      <w:r>
+        <w:rPr>
+          <w:lang w:val="en-US"/>
+        </w:rPr>
         <w:t>END $$;</w:t>
       </w:r>
     </w:p>
-    <w:p/>
+    <w:p>
+      <w:pPr>
+        <w:rPr>
+          <w:lang w:val="en-US"/>
+        </w:rPr>
+      </w:pPr>
+      <w:r>
+        <w:rPr>
+          <w:lang w:val="en-US"/>
+        </w:rPr>
+        <w:t>$ git push -u origin main</w:t>
+      </w:r>
+    </w:p>
+    <w:p>
+      <w:pPr>
+        <w:rPr>
+          <w:lang w:val="en-US"/>
+        </w:rPr>
+      </w:pPr>
+    </w:p>
     <w:sectPr>
       <w:pgSz w:w="12240" w:h="15840"/>
       <w:pgMar w:top="1417" w:right="1701" w:bottom="1417" w:left="1701" w:header="708" w:footer="708" w:gutter="0"/>
@@ -1555,7 +1598,6 @@
   <w:style w:type="character" w:default="1" w:styleId="Fuentedeprrafopredeter">
     <w:name w:val="Default Paragraph Font"/>
     <w:uiPriority w:val="1"/>
-    <w:semiHidden/>
     <w:unhideWhenUsed/>
   </w:style>
   <w:style w:type="table" w:default="1" w:styleId="Tablanormal">

</xml_diff>